<commit_message>
DOCX completion 1/5: pagination + virtualized, zoomable page viewer
Split dv-docx into layout (Vec<Line> at zoom 1) vs raster (render_page(idx,scale)):
parse w:h (page height, default Letter 816x1056), greedy line-atomic pagination,
per-page render that translates content into page-local space at scale.

- WASM DocxDoc session (pageCount/pageSize/renderPage) mirroring PptxDeck/XlsxBook.
- JS DocxViewer: per-page placeholders, IntersectionObserver render+evict, zoom
  (buttons + Ctrl/Cmd-wheel + fit-width). render_document (continuous) kept.

Verified in-browser: 30-paragraph doc → 4 page cards, only ~2 canvases live,
eviction on scroll to the last page, 繁中 + wrapping intact.

Co-Authored-By: Claude Opus 4.8 (1M context) <noreply@anthropic.com>
</commit_message>
<xml_diff>
--- a/examples/assets/sample.docx
+++ b/examples/assets/sample.docx
@@ -111,6 +111,325 @@
           <w:color w:val="888888"/>
         </w:rPr>
         <w:t xml:space="preserve">— 完 —</w:t>
+      </w:r>
+    </w:p>
+    <w:p>
+      <w:pPr>
+        <w:jc w:val="both"/>
+      </w:pPr>
+      <w:r>
+        <w:rPr>
+          <w:sz w:val="24"/>
+        </w:rPr>
+        <w:t xml:space="preserve">第 1 段:這是用來測試分頁與頁面虛擬化的內文。doc-viewer 將流式內容切成固定大小的頁面,只渲染視窗附近的頁,捲離很遠的頁會釋放以維持恆定記憶體。Paragraph 1: pagination and viewport virtualization with mixed 中文 and English so lines wrap across the page width.</w:t>
+      </w:r>
+    </w:p>
+    <w:p>
+      <w:pPr>
+        <w:jc w:val="both"/>
+      </w:pPr>
+      <w:r>
+        <w:rPr>
+          <w:sz w:val="24"/>
+        </w:rPr>
+        <w:t xml:space="preserve">第 2 段:這是用來測試分頁與頁面虛擬化的內文。doc-viewer 將流式內容切成固定大小的頁面,只渲染視窗附近的頁,捲離很遠的頁會釋放以維持恆定記憶體。Paragraph 2: pagination and viewport virtualization with mixed 中文 and English so lines wrap across the page width.</w:t>
+      </w:r>
+    </w:p>
+    <w:p>
+      <w:pPr>
+        <w:jc w:val="both"/>
+      </w:pPr>
+      <w:r>
+        <w:rPr>
+          <w:sz w:val="24"/>
+        </w:rPr>
+        <w:t xml:space="preserve">第 3 段:這是用來測試分頁與頁面虛擬化的內文。doc-viewer 將流式內容切成固定大小的頁面,只渲染視窗附近的頁,捲離很遠的頁會釋放以維持恆定記憶體。Paragraph 3: pagination and viewport virtualization with mixed 中文 and English so lines wrap across the page width.</w:t>
+      </w:r>
+    </w:p>
+    <w:p>
+      <w:pPr>
+        <w:jc w:val="both"/>
+      </w:pPr>
+      <w:r>
+        <w:rPr>
+          <w:sz w:val="24"/>
+        </w:rPr>
+        <w:t xml:space="preserve">第 4 段:這是用來測試分頁與頁面虛擬化的內文。doc-viewer 將流式內容切成固定大小的頁面,只渲染視窗附近的頁,捲離很遠的頁會釋放以維持恆定記憶體。Paragraph 4: pagination and viewport virtualization with mixed 中文 and English so lines wrap across the page width.</w:t>
+      </w:r>
+    </w:p>
+    <w:p>
+      <w:pPr>
+        <w:jc w:val="both"/>
+      </w:pPr>
+      <w:r>
+        <w:rPr>
+          <w:sz w:val="24"/>
+        </w:rPr>
+        <w:t xml:space="preserve">第 5 段:這是用來測試分頁與頁面虛擬化的內文。doc-viewer 將流式內容切成固定大小的頁面,只渲染視窗附近的頁,捲離很遠的頁會釋放以維持恆定記憶體。Paragraph 5: pagination and viewport virtualization with mixed 中文 and English so lines wrap across the page width.</w:t>
+      </w:r>
+    </w:p>
+    <w:p>
+      <w:pPr>
+        <w:jc w:val="both"/>
+      </w:pPr>
+      <w:r>
+        <w:rPr>
+          <w:sz w:val="24"/>
+        </w:rPr>
+        <w:t xml:space="preserve">第 6 段:這是用來測試分頁與頁面虛擬化的內文。doc-viewer 將流式內容切成固定大小的頁面,只渲染視窗附近的頁,捲離很遠的頁會釋放以維持恆定記憶體。Paragraph 6: pagination and viewport virtualization with mixed 中文 and English so lines wrap across the page width.</w:t>
+      </w:r>
+    </w:p>
+    <w:p>
+      <w:pPr>
+        <w:jc w:val="both"/>
+      </w:pPr>
+      <w:r>
+        <w:rPr>
+          <w:sz w:val="24"/>
+        </w:rPr>
+        <w:t xml:space="preserve">第 7 段:這是用來測試分頁與頁面虛擬化的內文。doc-viewer 將流式內容切成固定大小的頁面,只渲染視窗附近的頁,捲離很遠的頁會釋放以維持恆定記憶體。Paragraph 7: pagination and viewport virtualization with mixed 中文 and English so lines wrap across the page width.</w:t>
+      </w:r>
+    </w:p>
+    <w:p>
+      <w:pPr>
+        <w:jc w:val="both"/>
+      </w:pPr>
+      <w:r>
+        <w:rPr>
+          <w:sz w:val="24"/>
+        </w:rPr>
+        <w:t xml:space="preserve">第 8 段:這是用來測試分頁與頁面虛擬化的內文。doc-viewer 將流式內容切成固定大小的頁面,只渲染視窗附近的頁,捲離很遠的頁會釋放以維持恆定記憶體。Paragraph 8: pagination and viewport virtualization with mixed 中文 and English so lines wrap across the page width.</w:t>
+      </w:r>
+    </w:p>
+    <w:p>
+      <w:pPr>
+        <w:jc w:val="both"/>
+      </w:pPr>
+      <w:r>
+        <w:rPr>
+          <w:sz w:val="24"/>
+        </w:rPr>
+        <w:t xml:space="preserve">第 9 段:這是用來測試分頁與頁面虛擬化的內文。doc-viewer 將流式內容切成固定大小的頁面,只渲染視窗附近的頁,捲離很遠的頁會釋放以維持恆定記憶體。Paragraph 9: pagination and viewport virtualization with mixed 中文 and English so lines wrap across the page width.</w:t>
+      </w:r>
+    </w:p>
+    <w:p>
+      <w:pPr>
+        <w:jc w:val="both"/>
+      </w:pPr>
+      <w:r>
+        <w:rPr>
+          <w:sz w:val="24"/>
+        </w:rPr>
+        <w:t xml:space="preserve">第 10 段:這是用來測試分頁與頁面虛擬化的內文。doc-viewer 將流式內容切成固定大小的頁面,只渲染視窗附近的頁,捲離很遠的頁會釋放以維持恆定記憶體。Paragraph 10: pagination and viewport virtualization with mixed 中文 and English so lines wrap across the page width.</w:t>
+      </w:r>
+    </w:p>
+    <w:p>
+      <w:pPr>
+        <w:jc w:val="both"/>
+      </w:pPr>
+      <w:r>
+        <w:rPr>
+          <w:sz w:val="24"/>
+        </w:rPr>
+        <w:t xml:space="preserve">第 11 段:這是用來測試分頁與頁面虛擬化的內文。doc-viewer 將流式內容切成固定大小的頁面,只渲染視窗附近的頁,捲離很遠的頁會釋放以維持恆定記憶體。Paragraph 11: pagination and viewport virtualization with mixed 中文 and English so lines wrap across the page width.</w:t>
+      </w:r>
+    </w:p>
+    <w:p>
+      <w:pPr>
+        <w:jc w:val="both"/>
+      </w:pPr>
+      <w:r>
+        <w:rPr>
+          <w:sz w:val="24"/>
+        </w:rPr>
+        <w:t xml:space="preserve">第 12 段:這是用來測試分頁與頁面虛擬化的內文。doc-viewer 將流式內容切成固定大小的頁面,只渲染視窗附近的頁,捲離很遠的頁會釋放以維持恆定記憶體。Paragraph 12: pagination and viewport virtualization with mixed 中文 and English so lines wrap across the page width.</w:t>
+      </w:r>
+    </w:p>
+    <w:p>
+      <w:pPr>
+        <w:jc w:val="both"/>
+      </w:pPr>
+      <w:r>
+        <w:rPr>
+          <w:sz w:val="24"/>
+        </w:rPr>
+        <w:t xml:space="preserve">第 13 段:這是用來測試分頁與頁面虛擬化的內文。doc-viewer 將流式內容切成固定大小的頁面,只渲染視窗附近的頁,捲離很遠的頁會釋放以維持恆定記憶體。Paragraph 13: pagination and viewport virtualization with mixed 中文 and English so lines wrap across the page width.</w:t>
+      </w:r>
+    </w:p>
+    <w:p>
+      <w:pPr>
+        <w:jc w:val="both"/>
+      </w:pPr>
+      <w:r>
+        <w:rPr>
+          <w:sz w:val="24"/>
+        </w:rPr>
+        <w:t xml:space="preserve">第 14 段:這是用來測試分頁與頁面虛擬化的內文。doc-viewer 將流式內容切成固定大小的頁面,只渲染視窗附近的頁,捲離很遠的頁會釋放以維持恆定記憶體。Paragraph 14: pagination and viewport virtualization with mixed 中文 and English so lines wrap across the page width.</w:t>
+      </w:r>
+    </w:p>
+    <w:p>
+      <w:pPr>
+        <w:jc w:val="both"/>
+      </w:pPr>
+      <w:r>
+        <w:rPr>
+          <w:sz w:val="24"/>
+        </w:rPr>
+        <w:t xml:space="preserve">第 15 段:這是用來測試分頁與頁面虛擬化的內文。doc-viewer 將流式內容切成固定大小的頁面,只渲染視窗附近的頁,捲離很遠的頁會釋放以維持恆定記憶體。Paragraph 15: pagination and viewport virtualization with mixed 中文 and English so lines wrap across the page width.</w:t>
+      </w:r>
+    </w:p>
+    <w:p>
+      <w:pPr>
+        <w:jc w:val="both"/>
+      </w:pPr>
+      <w:r>
+        <w:rPr>
+          <w:sz w:val="24"/>
+        </w:rPr>
+        <w:t xml:space="preserve">第 16 段:這是用來測試分頁與頁面虛擬化的內文。doc-viewer 將流式內容切成固定大小的頁面,只渲染視窗附近的頁,捲離很遠的頁會釋放以維持恆定記憶體。Paragraph 16: pagination and viewport virtualization with mixed 中文 and English so lines wrap across the page width.</w:t>
+      </w:r>
+    </w:p>
+    <w:p>
+      <w:pPr>
+        <w:jc w:val="both"/>
+      </w:pPr>
+      <w:r>
+        <w:rPr>
+          <w:sz w:val="24"/>
+        </w:rPr>
+        <w:t xml:space="preserve">第 17 段:這是用來測試分頁與頁面虛擬化的內文。doc-viewer 將流式內容切成固定大小的頁面,只渲染視窗附近的頁,捲離很遠的頁會釋放以維持恆定記憶體。Paragraph 17: pagination and viewport virtualization with mixed 中文 and English so lines wrap across the page width.</w:t>
+      </w:r>
+    </w:p>
+    <w:p>
+      <w:pPr>
+        <w:jc w:val="both"/>
+      </w:pPr>
+      <w:r>
+        <w:rPr>
+          <w:sz w:val="24"/>
+        </w:rPr>
+        <w:t xml:space="preserve">第 18 段:這是用來測試分頁與頁面虛擬化的內文。doc-viewer 將流式內容切成固定大小的頁面,只渲染視窗附近的頁,捲離很遠的頁會釋放以維持恆定記憶體。Paragraph 18: pagination and viewport virtualization with mixed 中文 and English so lines wrap across the page width.</w:t>
+      </w:r>
+    </w:p>
+    <w:p>
+      <w:pPr>
+        <w:jc w:val="both"/>
+      </w:pPr>
+      <w:r>
+        <w:rPr>
+          <w:sz w:val="24"/>
+        </w:rPr>
+        <w:t xml:space="preserve">第 19 段:這是用來測試分頁與頁面虛擬化的內文。doc-viewer 將流式內容切成固定大小的頁面,只渲染視窗附近的頁,捲離很遠的頁會釋放以維持恆定記憶體。Paragraph 19: pagination and viewport virtualization with mixed 中文 and English so lines wrap across the page width.</w:t>
+      </w:r>
+    </w:p>
+    <w:p>
+      <w:pPr>
+        <w:jc w:val="both"/>
+      </w:pPr>
+      <w:r>
+        <w:rPr>
+          <w:sz w:val="24"/>
+        </w:rPr>
+        <w:t xml:space="preserve">第 20 段:這是用來測試分頁與頁面虛擬化的內文。doc-viewer 將流式內容切成固定大小的頁面,只渲染視窗附近的頁,捲離很遠的頁會釋放以維持恆定記憶體。Paragraph 20: pagination and viewport virtualization with mixed 中文 and English so lines wrap across the page width.</w:t>
+      </w:r>
+    </w:p>
+    <w:p>
+      <w:pPr>
+        <w:jc w:val="both"/>
+      </w:pPr>
+      <w:r>
+        <w:rPr>
+          <w:sz w:val="24"/>
+        </w:rPr>
+        <w:t xml:space="preserve">第 21 段:這是用來測試分頁與頁面虛擬化的內文。doc-viewer 將流式內容切成固定大小的頁面,只渲染視窗附近的頁,捲離很遠的頁會釋放以維持恆定記憶體。Paragraph 21: pagination and viewport virtualization with mixed 中文 and English so lines wrap across the page width.</w:t>
+      </w:r>
+    </w:p>
+    <w:p>
+      <w:pPr>
+        <w:jc w:val="both"/>
+      </w:pPr>
+      <w:r>
+        <w:rPr>
+          <w:sz w:val="24"/>
+        </w:rPr>
+        <w:t xml:space="preserve">第 22 段:這是用來測試分頁與頁面虛擬化的內文。doc-viewer 將流式內容切成固定大小的頁面,只渲染視窗附近的頁,捲離很遠的頁會釋放以維持恆定記憶體。Paragraph 22: pagination and viewport virtualization with mixed 中文 and English so lines wrap across the page width.</w:t>
+      </w:r>
+    </w:p>
+    <w:p>
+      <w:pPr>
+        <w:jc w:val="both"/>
+      </w:pPr>
+      <w:r>
+        <w:rPr>
+          <w:sz w:val="24"/>
+        </w:rPr>
+        <w:t xml:space="preserve">第 23 段:這是用來測試分頁與頁面虛擬化的內文。doc-viewer 將流式內容切成固定大小的頁面,只渲染視窗附近的頁,捲離很遠的頁會釋放以維持恆定記憶體。Paragraph 23: pagination and viewport virtualization with mixed 中文 and English so lines wrap across the page width.</w:t>
+      </w:r>
+    </w:p>
+    <w:p>
+      <w:pPr>
+        <w:jc w:val="both"/>
+      </w:pPr>
+      <w:r>
+        <w:rPr>
+          <w:sz w:val="24"/>
+        </w:rPr>
+        <w:t xml:space="preserve">第 24 段:這是用來測試分頁與頁面虛擬化的內文。doc-viewer 將流式內容切成固定大小的頁面,只渲染視窗附近的頁,捲離很遠的頁會釋放以維持恆定記憶體。Paragraph 24: pagination and viewport virtualization with mixed 中文 and English so lines wrap across the page width.</w:t>
+      </w:r>
+    </w:p>
+    <w:p>
+      <w:pPr>
+        <w:jc w:val="both"/>
+      </w:pPr>
+      <w:r>
+        <w:rPr>
+          <w:sz w:val="24"/>
+        </w:rPr>
+        <w:t xml:space="preserve">第 25 段:這是用來測試分頁與頁面虛擬化的內文。doc-viewer 將流式內容切成固定大小的頁面,只渲染視窗附近的頁,捲離很遠的頁會釋放以維持恆定記憶體。Paragraph 25: pagination and viewport virtualization with mixed 中文 and English so lines wrap across the page width.</w:t>
+      </w:r>
+    </w:p>
+    <w:p>
+      <w:pPr>
+        <w:jc w:val="both"/>
+      </w:pPr>
+      <w:r>
+        <w:rPr>
+          <w:sz w:val="24"/>
+        </w:rPr>
+        <w:t xml:space="preserve">第 26 段:這是用來測試分頁與頁面虛擬化的內文。doc-viewer 將流式內容切成固定大小的頁面,只渲染視窗附近的頁,捲離很遠的頁會釋放以維持恆定記憶體。Paragraph 26: pagination and viewport virtualization with mixed 中文 and English so lines wrap across the page width.</w:t>
+      </w:r>
+    </w:p>
+    <w:p>
+      <w:pPr>
+        <w:jc w:val="both"/>
+      </w:pPr>
+      <w:r>
+        <w:rPr>
+          <w:sz w:val="24"/>
+        </w:rPr>
+        <w:t xml:space="preserve">第 27 段:這是用來測試分頁與頁面虛擬化的內文。doc-viewer 將流式內容切成固定大小的頁面,只渲染視窗附近的頁,捲離很遠的頁會釋放以維持恆定記憶體。Paragraph 27: pagination and viewport virtualization with mixed 中文 and English so lines wrap across the page width.</w:t>
+      </w:r>
+    </w:p>
+    <w:p>
+      <w:pPr>
+        <w:jc w:val="both"/>
+      </w:pPr>
+      <w:r>
+        <w:rPr>
+          <w:sz w:val="24"/>
+        </w:rPr>
+        <w:t xml:space="preserve">第 28 段:這是用來測試分頁與頁面虛擬化的內文。doc-viewer 將流式內容切成固定大小的頁面,只渲染視窗附近的頁,捲離很遠的頁會釋放以維持恆定記憶體。Paragraph 28: pagination and viewport virtualization with mixed 中文 and English so lines wrap across the page width.</w:t>
+      </w:r>
+    </w:p>
+    <w:p>
+      <w:pPr>
+        <w:jc w:val="both"/>
+      </w:pPr>
+      <w:r>
+        <w:rPr>
+          <w:sz w:val="24"/>
+        </w:rPr>
+        <w:t xml:space="preserve">第 29 段:這是用來測試分頁與頁面虛擬化的內文。doc-viewer 將流式內容切成固定大小的頁面,只渲染視窗附近的頁,捲離很遠的頁會釋放以維持恆定記憶體。Paragraph 29: pagination and viewport virtualization with mixed 中文 and English so lines wrap across the page width.</w:t>
       </w:r>
     </w:p>
     <w:sectPr>

</xml_diff>

<commit_message>
DOCX completion 2/5: styles.xml inheritance
Run/Para now carry Option overrides + style refs; parse word/styles.xml into a
StyleTable (docDefaults + paragraph/character styles with basedOn). Resolve
effective run rPr (docDefault -> paragraph-style chain root->derived -> char-style
chain -> direct) and paragraph alignment, with built-in Heading/Title fallbacks
and a basedOn cycle guard. NO IR change.

Verified in-browser: a pStyle="Heading1" paragraph with no direct formatting
renders bold+blue+large (all inherited); Heading2 (basedOn Heading1) inherits
bold+blue and overrides size.

Co-Authored-By: Claude Opus 4.8 (1M context) <noreply@anthropic.com>
</commit_message>
<xml_diff>
--- a/examples/assets/sample.docx
+++ b/examples/assets/sample.docx
@@ -13,6 +13,26 @@
           <w:color w:val="1F6FEB"/>
         </w:rPr>
         <w:t xml:space="preserve">doc-viewer 文件檢視器</w:t>
+      </w:r>
+    </w:p>
+    <w:p>
+      <w:pPr>
+        <w:pStyle w:val="Heading1"/>
+        <w:jc w:val="left"/>
+      </w:pPr>
+      <w:r>
+        <w:rPr/>
+        <w:t xml:space="preserve">樣式繼承 Heading1(粗體+藍+大字,皆繼承自樣式)</w:t>
+      </w:r>
+    </w:p>
+    <w:p>
+      <w:pPr>
+        <w:pStyle w:val="Heading2"/>
+        <w:jc w:val="left"/>
+      </w:pPr>
+      <w:r>
+        <w:rPr/>
+        <w:t xml:space="preserve">樣式繼承 Heading2(basedOn H1:繼承粗體+藍,字級改小)</w:t>
       </w:r>
     </w:p>
     <w:p>
@@ -438,4 +458,31 @@
     </w:sectPr>
   </w:body>
 </w:document>
+</file>
+
+<file path=word/styles.xml><?xml version="1.0" encoding="utf-8"?>
+<w:styles xmlns:w="http://schemas.openxmlformats.org/wordprocessingml/2006/main">
+  <w:docDefaults>
+    <w:rPrDefault>
+      <w:rPr>
+        <w:sz w:val="24"/>
+      </w:rPr>
+    </w:rPrDefault>
+  </w:docDefaults>
+  <w:style w:type="paragraph" w:styleId="Heading1">
+    <w:name w:val="heading 1"/>
+    <w:rPr>
+      <w:b/>
+      <w:color w:val="1F6FEB"/>
+      <w:sz w:val="40"/>
+    </w:rPr>
+  </w:style>
+  <w:style w:type="paragraph" w:styleId="Heading2">
+    <w:name w:val="heading 2"/>
+    <w:basedOn w:val="Heading1"/>
+    <w:rPr>
+      <w:sz w:val="28"/>
+    </w:rPr>
+  </w:style>
+</w:styles>
 </file>
</xml_diff>

<commit_message>
DOCX completion 3/5: lists & numbering
Parse word/numbering.xml (abstractNum levels: numFmt/lvlText/start/ind, num->
abstractNum). Per-paragraph w:numPr (ilvl/numId) + direct w:ind. Stateful pass
keyed by (numId,ilvl): first use = start, increment after, reset deeper levels;
%N (1-based -> ilvl N-1) lvlText substitution formatted per ref level
(decimal/decimalZero/lower|upperLetter/lower|upperRoman); bullet char with PUA
remap. Hanging-indent layout: body text indented, marker hung on the first line.

Verified in-browser: bullets, 1./2., nested a)/b) (reset), 3. (continuation),
correct indents, 繁中.

Co-Authored-By: Claude Opus 4.8 (1M context) <noreply@anthropic.com>
</commit_message>
<xml_diff>
--- a/examples/assets/sample.docx
+++ b/examples/assets/sample.docx
@@ -119,6 +119,138 @@
           <w:sz w:val="24"/>
         </w:rPr>
         <w:t xml:space="preserve"> 與段落對齊(左/中/右/兩端)。</w:t>
+      </w:r>
+    </w:p>
+    <w:p>
+      <w:pPr>
+        <w:jc w:val="left"/>
+      </w:pPr>
+      <w:r>
+        <w:rPr>
+          <w:b/>
+          <w:sz w:val="32"/>
+        </w:rPr>
+        <w:t xml:space="preserve">三、清單與編號測試</w:t>
+      </w:r>
+    </w:p>
+    <w:p>
+      <w:pPr>
+        <w:numPr>
+          <w:ilvl w:val="0"/>
+          <w:numId w:val="2"/>
+        </w:numPr>
+        <w:jc w:val="left"/>
+      </w:pPr>
+      <w:r>
+        <w:rPr>
+          <w:sz w:val="24"/>
+        </w:rPr>
+        <w:t xml:space="preserve">項目符號一</w:t>
+      </w:r>
+    </w:p>
+    <w:p>
+      <w:pPr>
+        <w:numPr>
+          <w:ilvl w:val="0"/>
+          <w:numId w:val="2"/>
+        </w:numPr>
+        <w:jc w:val="left"/>
+      </w:pPr>
+      <w:r>
+        <w:rPr>
+          <w:sz w:val="24"/>
+        </w:rPr>
+        <w:t xml:space="preserve">項目符號二</w:t>
+      </w:r>
+    </w:p>
+    <w:p>
+      <w:pPr>
+        <w:numPr>
+          <w:ilvl w:val="0"/>
+          <w:numId w:val="2"/>
+        </w:numPr>
+        <w:jc w:val="left"/>
+      </w:pPr>
+      <w:r>
+        <w:rPr>
+          <w:sz w:val="24"/>
+        </w:rPr>
+        <w:t xml:space="preserve">項目符號三</w:t>
+      </w:r>
+    </w:p>
+    <w:p>
+      <w:pPr>
+        <w:numPr>
+          <w:ilvl w:val="0"/>
+          <w:numId w:val="1"/>
+        </w:numPr>
+        <w:jc w:val="left"/>
+      </w:pPr>
+      <w:r>
+        <w:rPr>
+          <w:sz w:val="24"/>
+        </w:rPr>
+        <w:t xml:space="preserve">第一點(decimal)</w:t>
+      </w:r>
+    </w:p>
+    <w:p>
+      <w:pPr>
+        <w:numPr>
+          <w:ilvl w:val="0"/>
+          <w:numId w:val="1"/>
+        </w:numPr>
+        <w:jc w:val="left"/>
+      </w:pPr>
+      <w:r>
+        <w:rPr>
+          <w:sz w:val="24"/>
+        </w:rPr>
+        <w:t xml:space="preserve">第二點</w:t>
+      </w:r>
+    </w:p>
+    <w:p>
+      <w:pPr>
+        <w:numPr>
+          <w:ilvl w:val="1"/>
+          <w:numId w:val="1"/>
+        </w:numPr>
+        <w:jc w:val="left"/>
+      </w:pPr>
+      <w:r>
+        <w:rPr>
+          <w:sz w:val="24"/>
+        </w:rPr>
+        <w:t xml:space="preserve">子項目(lowerLetter a)</w:t>
+      </w:r>
+    </w:p>
+    <w:p>
+      <w:pPr>
+        <w:numPr>
+          <w:ilvl w:val="1"/>
+          <w:numId w:val="1"/>
+        </w:numPr>
+        <w:jc w:val="left"/>
+      </w:pPr>
+      <w:r>
+        <w:rPr>
+          <w:sz w:val="24"/>
+        </w:rPr>
+        <w:t xml:space="preserve">子項目(lowerLetter b)</w:t>
+      </w:r>
+    </w:p>
+    <w:p>
+      <w:pPr>
+        <w:numPr>
+          <w:ilvl w:val="0"/>
+          <w:numId w:val="1"/>
+        </w:numPr>
+        <w:jc w:val="left"/>
+      </w:pPr>
+      <w:r>
+        <w:rPr>
+          <w:sz w:val="24"/>
+        </w:rPr>
+        <w:t xml:space="preserve">第三點(計數延續,應為 3.)</w:t>
       </w:r>
     </w:p>
     <w:p>
@@ -458,6 +590,45 @@
     </w:sectPr>
   </w:body>
 </w:document>
+</file>
+
+<file path=word/numbering.xml><?xml version="1.0" encoding="utf-8"?>
+<w:numbering xmlns:w="http://schemas.openxmlformats.org/wordprocessingml/2006/main">
+  <w:abstractNum w:abstractNumId="0">
+    <w:lvl w:ilvl="0">
+      <w:start w:val="1"/>
+      <w:numFmt w:val="decimal"/>
+      <w:lvlText w:val="%1."/>
+      <w:pPr>
+        <w:ind w:left="480" w:hanging="360"/>
+      </w:pPr>
+    </w:lvl>
+    <w:lvl w:ilvl="1">
+      <w:start w:val="1"/>
+      <w:numFmt w:val="lowerLetter"/>
+      <w:lvlText w:val="%2)"/>
+      <w:pPr>
+        <w:ind w:left="960" w:hanging="360"/>
+      </w:pPr>
+    </w:lvl>
+  </w:abstractNum>
+  <w:abstractNum w:abstractNumId="1">
+    <w:lvl w:ilvl="0">
+      <w:start w:val="1"/>
+      <w:numFmt w:val="bullet"/>
+      <w:lvlText w:val="•"/>
+      <w:pPr>
+        <w:ind w:left="480" w:hanging="360"/>
+      </w:pPr>
+    </w:lvl>
+  </w:abstractNum>
+  <w:num w:numId="1">
+    <w:abstractNumId w:val="0"/>
+  </w:num>
+  <w:num w:numId="2">
+    <w:abstractNumId w:val="1"/>
+  </w:num>
+</w:numbering>
 </file>
 
 <file path=word/styles.xml><?xml version="1.0" encoding="utf-8"?>

</xml_diff>

<commit_message>
Images for PPTX (p:pic) and DOCX (inline w:drawing)
Uses dv-image (M0) + the existing Command::Image. PPTX: p:pic blipFill a:blip
r:embed -> slide rels -> ppt/media, drawn at the shape's a:off/a:ext rect. DOCX:
run w:drawing wp:extent + a:blip r:embed -> document rels -> word/media, rendered
as an inline image block scaled to fit content width. Shared rels/path-resolve
helpers; decode -> Command::Image -> tiny-skia bilinear blit.

Verified in-browser: PPTX slide shows the embedded PNG beside text; DOCX page
shows the inline PNG between heading and lists. Core wasm 1.5MB -> 1.7MB (decoders).

Co-Authored-By: Claude Opus 4.8 (1M context) <noreply@anthropic.com>
</commit_message>
<xml_diff>
--- a/examples/assets/sample.docx
+++ b/examples/assets/sample.docx
@@ -1,6 +1,6 @@
 
 <file path=word/document.xml><?xml version="1.0" encoding="utf-8"?>
-<w:document xmlns:w="http://schemas.openxmlformats.org/wordprocessingml/2006/main">
+<w:document xmlns:w="http://schemas.openxmlformats.org/wordprocessingml/2006/main" xmlns:r="http://schemas.openxmlformats.org/officeDocument/2006/relationships" xmlns:wp="http://schemas.openxmlformats.org/drawingml/2006/wordprocessingDrawing" xmlns:a="http://schemas.openxmlformats.org/drawingml/2006/main" xmlns:pic="http://schemas.openxmlformats.org/drawingml/2006/picture">
   <w:body>
     <w:p>
       <w:pPr>
@@ -119,6 +119,53 @@
           <w:sz w:val="24"/>
         </w:rPr>
         <w:t xml:space="preserve"> 與段落對齊(左/中/右/兩端)。</w:t>
+      </w:r>
+    </w:p>
+    <w:p>
+      <w:pPr>
+        <w:jc w:val="left"/>
+      </w:pPr>
+      <w:r>
+        <w:rPr>
+          <w:b/>
+          <w:sz w:val="32"/>
+        </w:rPr>
+        <w:t xml:space="preserve">四、內嵌圖片(PNG,inline w:drawing)</w:t>
+      </w:r>
+    </w:p>
+    <w:p>
+      <w:r>
+        <w:drawing>
+          <wp:inline distT="0" distB="0" distL="0" distR="0">
+            <wp:extent cx="2286000" cy="1428750"/>
+            <wp:docPr id="1" name="img"/>
+            <a:graphic>
+              <a:graphicData uri="http://schemas.openxmlformats.org/drawingml/2006/picture">
+                <pic:pic>
+                  <pic:nvPicPr>
+                    <pic:cNvPr id="0" name="img"/>
+                    <pic:cNvPicPr/>
+                  </pic:nvPicPr>
+                  <pic:blipFill>
+                    <a:blip r:embed="rIdImg"/>
+                    <a:stretch>
+                      <a:fillRect/>
+                    </a:stretch>
+                  </pic:blipFill>
+                  <pic:spPr>
+                    <a:xfrm>
+                      <a:off x="0" y="0"/>
+                      <a:ext cx="2286000" cy="1428750"/>
+                    </a:xfrm>
+                    <a:prstGeom prst="rect">
+                      <a:avLst/>
+                    </a:prstGeom>
+                  </pic:spPr>
+                </pic:pic>
+              </a:graphicData>
+            </a:graphic>
+          </wp:inline>
+        </w:drawing>
       </w:r>
     </w:p>
     <w:p>

</xml_diff>